<commit_message>
more changes to skills
</commit_message>
<xml_diff>
--- a/assets/pdf/Chinemerem_Okezie_CV.docx
+++ b/assets/pdf/Chinemerem_Okezie_CV.docx
@@ -5,6 +5,7 @@
     <w:p>
       <w:pPr>
         <w:spacing w:line="240" w:lineRule="auto"/>
+        <w:jc w:val="center"/>
         <w:rPr>
           <w:rFonts w:ascii="Calibri" w:hAnsi="Calibri" w:cs="Calibri"/>
           <w:b/>
@@ -1223,15 +1224,159 @@
           <w:sz w:val="22"/>
           <w:szCs w:val="22"/>
         </w:rPr>
-        <w:t xml:space="preserve">Investigating the impact of rock/fluid composition and different </w:t>
-      </w:r>
-      <w:r>
-        <w:rPr>
-          <w:rFonts w:ascii="Calibri" w:hAnsi="Calibri" w:cs="Calibri"/>
-          <w:sz w:val="22"/>
-          <w:szCs w:val="22"/>
-        </w:rPr>
-        <w:t>hydrothermal conditions on geologic hydrogen production via serpentinization.</w:t>
+        <w:t>Utiliz</w:t>
+      </w:r>
+      <w:r>
+        <w:rPr>
+          <w:rFonts w:ascii="Calibri" w:hAnsi="Calibri" w:cs="Calibri"/>
+          <w:sz w:val="22"/>
+          <w:szCs w:val="22"/>
+        </w:rPr>
+        <w:t>ing</w:t>
+      </w:r>
+      <w:r>
+        <w:rPr>
+          <w:rFonts w:ascii="Calibri" w:hAnsi="Calibri" w:cs="Calibri"/>
+          <w:sz w:val="22"/>
+          <w:szCs w:val="22"/>
+        </w:rPr>
+        <w:t xml:space="preserve"> analytical techniques such as scanning electron microscopy </w:t>
+      </w:r>
+      <w:r>
+        <w:rPr>
+          <w:rFonts w:ascii="Calibri" w:hAnsi="Calibri" w:cs="Calibri"/>
+          <w:sz w:val="22"/>
+          <w:szCs w:val="22"/>
+        </w:rPr>
+        <w:t xml:space="preserve">coupled with energy dispersive </w:t>
+      </w:r>
+      <w:r>
+        <w:rPr>
+          <w:rFonts w:ascii="Calibri" w:hAnsi="Calibri" w:cs="Calibri"/>
+          <w:sz w:val="22"/>
+          <w:szCs w:val="22"/>
+        </w:rPr>
+        <w:t>X</w:t>
+      </w:r>
+      <w:r>
+        <w:rPr>
+          <w:rFonts w:ascii="Calibri" w:hAnsi="Calibri" w:cs="Calibri"/>
+          <w:sz w:val="22"/>
+          <w:szCs w:val="22"/>
+        </w:rPr>
+        <w:t xml:space="preserve">-ray </w:t>
+      </w:r>
+      <w:r>
+        <w:rPr>
+          <w:rFonts w:ascii="Calibri" w:hAnsi="Calibri" w:cs="Calibri"/>
+          <w:sz w:val="22"/>
+          <w:szCs w:val="22"/>
+        </w:rPr>
+        <w:t>spectroscopy (SEM-EDS)</w:t>
+      </w:r>
+      <w:r>
+        <w:rPr>
+          <w:rFonts w:ascii="Calibri" w:hAnsi="Calibri" w:cs="Calibri"/>
+          <w:sz w:val="22"/>
+          <w:szCs w:val="22"/>
+        </w:rPr>
+        <w:t>, X-ray D</w:t>
+      </w:r>
+      <w:r>
+        <w:rPr>
+          <w:rFonts w:ascii="Calibri" w:hAnsi="Calibri" w:cs="Calibri"/>
+          <w:sz w:val="22"/>
+          <w:szCs w:val="22"/>
+        </w:rPr>
+        <w:t>iffraction</w:t>
+      </w:r>
+      <w:r>
+        <w:rPr>
+          <w:rFonts w:ascii="Calibri" w:hAnsi="Calibri" w:cs="Calibri"/>
+          <w:sz w:val="22"/>
+          <w:szCs w:val="22"/>
+        </w:rPr>
+        <w:t xml:space="preserve"> (XRD)</w:t>
+      </w:r>
+      <w:r>
+        <w:rPr>
+          <w:rFonts w:ascii="Calibri" w:hAnsi="Calibri" w:cs="Calibri"/>
+          <w:sz w:val="22"/>
+          <w:szCs w:val="22"/>
+        </w:rPr>
+        <w:t>, Therm</w:t>
+      </w:r>
+      <w:r>
+        <w:rPr>
+          <w:rFonts w:ascii="Calibri" w:hAnsi="Calibri" w:cs="Calibri"/>
+          <w:sz w:val="22"/>
+          <w:szCs w:val="22"/>
+        </w:rPr>
+        <w:t>og</w:t>
+      </w:r>
+      <w:r>
+        <w:rPr>
+          <w:rFonts w:ascii="Calibri" w:hAnsi="Calibri" w:cs="Calibri"/>
+          <w:sz w:val="22"/>
+          <w:szCs w:val="22"/>
+        </w:rPr>
+        <w:t>ravimetric Analysis</w:t>
+      </w:r>
+      <w:r>
+        <w:rPr>
+          <w:rFonts w:ascii="Calibri" w:hAnsi="Calibri" w:cs="Calibri"/>
+          <w:sz w:val="22"/>
+          <w:szCs w:val="22"/>
+        </w:rPr>
+        <w:t xml:space="preserve"> (TGA)</w:t>
+      </w:r>
+      <w:r>
+        <w:rPr>
+          <w:rFonts w:ascii="Calibri" w:hAnsi="Calibri" w:cs="Calibri"/>
+          <w:sz w:val="22"/>
+          <w:szCs w:val="22"/>
+        </w:rPr>
+        <w:t xml:space="preserve">, </w:t>
+      </w:r>
+      <w:r>
+        <w:rPr>
+          <w:rFonts w:ascii="Calibri" w:hAnsi="Calibri" w:cs="Calibri"/>
+          <w:sz w:val="22"/>
+          <w:szCs w:val="22"/>
+        </w:rPr>
+        <w:t xml:space="preserve">and </w:t>
+      </w:r>
+      <w:r>
+        <w:rPr>
+          <w:rFonts w:ascii="Calibri" w:hAnsi="Calibri" w:cs="Calibri"/>
+          <w:sz w:val="22"/>
+          <w:szCs w:val="22"/>
+        </w:rPr>
+        <w:t>Raman Spectroscopy</w:t>
+      </w:r>
+      <w:r>
+        <w:rPr>
+          <w:rFonts w:ascii="Calibri" w:hAnsi="Calibri" w:cs="Calibri"/>
+          <w:sz w:val="22"/>
+          <w:szCs w:val="22"/>
+        </w:rPr>
+        <w:t>, to</w:t>
+      </w:r>
+      <w:r>
+        <w:rPr>
+          <w:rFonts w:ascii="Calibri" w:hAnsi="Calibri" w:cs="Calibri"/>
+          <w:sz w:val="22"/>
+          <w:szCs w:val="22"/>
+        </w:rPr>
+        <w:t xml:space="preserve"> assess the </w:t>
+      </w:r>
+      <w:r>
+        <w:rPr>
+          <w:rFonts w:ascii="Calibri" w:hAnsi="Calibri" w:cs="Calibri"/>
+          <w:sz w:val="22"/>
+          <w:szCs w:val="22"/>
+        </w:rPr>
+        <w:t>reaction progress and mineralogical evolution.</w:t>
       </w:r>
     </w:p>
     <w:p>
@@ -1254,159 +1399,39 @@
           <w:sz w:val="22"/>
           <w:szCs w:val="22"/>
         </w:rPr>
-        <w:t>Utiliz</w:t>
-      </w:r>
-      <w:r>
-        <w:rPr>
-          <w:rFonts w:ascii="Calibri" w:hAnsi="Calibri" w:cs="Calibri"/>
-          <w:sz w:val="22"/>
-          <w:szCs w:val="22"/>
-        </w:rPr>
-        <w:t>ing</w:t>
-      </w:r>
-      <w:r>
-        <w:rPr>
-          <w:rFonts w:ascii="Calibri" w:hAnsi="Calibri" w:cs="Calibri"/>
-          <w:sz w:val="22"/>
-          <w:szCs w:val="22"/>
-        </w:rPr>
-        <w:t xml:space="preserve"> analytical techniques such as scanning electron microscopy </w:t>
-      </w:r>
-      <w:r>
-        <w:rPr>
-          <w:rFonts w:ascii="Calibri" w:hAnsi="Calibri" w:cs="Calibri"/>
-          <w:sz w:val="22"/>
-          <w:szCs w:val="22"/>
-        </w:rPr>
-        <w:t xml:space="preserve">coupled with energy dispersive </w:t>
-      </w:r>
-      <w:r>
-        <w:rPr>
-          <w:rFonts w:ascii="Calibri" w:hAnsi="Calibri" w:cs="Calibri"/>
-          <w:sz w:val="22"/>
-          <w:szCs w:val="22"/>
-        </w:rPr>
-        <w:t>X</w:t>
-      </w:r>
-      <w:r>
-        <w:rPr>
-          <w:rFonts w:ascii="Calibri" w:hAnsi="Calibri" w:cs="Calibri"/>
-          <w:sz w:val="22"/>
-          <w:szCs w:val="22"/>
-        </w:rPr>
-        <w:t xml:space="preserve">-ray </w:t>
-      </w:r>
-      <w:r>
-        <w:rPr>
-          <w:rFonts w:ascii="Calibri" w:hAnsi="Calibri" w:cs="Calibri"/>
-          <w:sz w:val="22"/>
-          <w:szCs w:val="22"/>
-        </w:rPr>
-        <w:t>spectroscopy (SEM-EDS)</w:t>
-      </w:r>
-      <w:r>
-        <w:rPr>
-          <w:rFonts w:ascii="Calibri" w:hAnsi="Calibri" w:cs="Calibri"/>
-          <w:sz w:val="22"/>
-          <w:szCs w:val="22"/>
-        </w:rPr>
-        <w:t>, X-ray D</w:t>
-      </w:r>
-      <w:r>
-        <w:rPr>
-          <w:rFonts w:ascii="Calibri" w:hAnsi="Calibri" w:cs="Calibri"/>
-          <w:sz w:val="22"/>
-          <w:szCs w:val="22"/>
-        </w:rPr>
-        <w:t>iffraction</w:t>
-      </w:r>
-      <w:r>
-        <w:rPr>
-          <w:rFonts w:ascii="Calibri" w:hAnsi="Calibri" w:cs="Calibri"/>
-          <w:sz w:val="22"/>
-          <w:szCs w:val="22"/>
-        </w:rPr>
-        <w:t xml:space="preserve"> (XRD)</w:t>
-      </w:r>
-      <w:r>
-        <w:rPr>
-          <w:rFonts w:ascii="Calibri" w:hAnsi="Calibri" w:cs="Calibri"/>
-          <w:sz w:val="22"/>
-          <w:szCs w:val="22"/>
-        </w:rPr>
-        <w:t>, Therm</w:t>
-      </w:r>
-      <w:r>
-        <w:rPr>
-          <w:rFonts w:ascii="Calibri" w:hAnsi="Calibri" w:cs="Calibri"/>
-          <w:sz w:val="22"/>
-          <w:szCs w:val="22"/>
-        </w:rPr>
-        <w:t>og</w:t>
-      </w:r>
-      <w:r>
-        <w:rPr>
-          <w:rFonts w:ascii="Calibri" w:hAnsi="Calibri" w:cs="Calibri"/>
-          <w:sz w:val="22"/>
-          <w:szCs w:val="22"/>
-        </w:rPr>
-        <w:t>ravimetric Analysis</w:t>
-      </w:r>
-      <w:r>
-        <w:rPr>
-          <w:rFonts w:ascii="Calibri" w:hAnsi="Calibri" w:cs="Calibri"/>
-          <w:sz w:val="22"/>
-          <w:szCs w:val="22"/>
-        </w:rPr>
-        <w:t xml:space="preserve"> (TGA)</w:t>
-      </w:r>
-      <w:r>
-        <w:rPr>
-          <w:rFonts w:ascii="Calibri" w:hAnsi="Calibri" w:cs="Calibri"/>
-          <w:sz w:val="22"/>
-          <w:szCs w:val="22"/>
-        </w:rPr>
-        <w:t xml:space="preserve">, </w:t>
-      </w:r>
-      <w:r>
-        <w:rPr>
-          <w:rFonts w:ascii="Calibri" w:hAnsi="Calibri" w:cs="Calibri"/>
-          <w:sz w:val="22"/>
-          <w:szCs w:val="22"/>
-        </w:rPr>
-        <w:t xml:space="preserve">and </w:t>
-      </w:r>
-      <w:r>
-        <w:rPr>
-          <w:rFonts w:ascii="Calibri" w:hAnsi="Calibri" w:cs="Calibri"/>
-          <w:sz w:val="22"/>
-          <w:szCs w:val="22"/>
-        </w:rPr>
-        <w:t>Raman Spectroscopy</w:t>
-      </w:r>
-      <w:r>
-        <w:rPr>
-          <w:rFonts w:ascii="Calibri" w:hAnsi="Calibri" w:cs="Calibri"/>
-          <w:sz w:val="22"/>
-          <w:szCs w:val="22"/>
-        </w:rPr>
-        <w:t>, to</w:t>
-      </w:r>
-      <w:r>
-        <w:rPr>
-          <w:rFonts w:ascii="Calibri" w:hAnsi="Calibri" w:cs="Calibri"/>
-          <w:sz w:val="22"/>
-          <w:szCs w:val="22"/>
-        </w:rPr>
-        <w:t xml:space="preserve"> assess the </w:t>
-      </w:r>
-      <w:r>
-        <w:rPr>
-          <w:rFonts w:ascii="Calibri" w:hAnsi="Calibri" w:cs="Calibri"/>
-          <w:sz w:val="22"/>
-          <w:szCs w:val="22"/>
-        </w:rPr>
-        <w:t>reaction progress and mineralogical evolution.</w:t>
+        <w:t xml:space="preserve">Utilizing geochemical models to </w:t>
+      </w:r>
+      <w:r>
+        <w:rPr>
+          <w:rFonts w:ascii="Calibri" w:hAnsi="Calibri" w:cs="Calibri"/>
+          <w:sz w:val="22"/>
+          <w:szCs w:val="22"/>
+        </w:rPr>
+        <w:t>assess the reaction kinetics and pathways</w:t>
+      </w:r>
+      <w:r>
+        <w:rPr>
+          <w:rFonts w:ascii="Calibri" w:hAnsi="Calibri" w:cs="Calibri"/>
+          <w:sz w:val="22"/>
+          <w:szCs w:val="22"/>
+        </w:rPr>
+        <w:t>,</w:t>
+      </w:r>
+      <w:r>
+        <w:rPr>
+          <w:rFonts w:ascii="Calibri" w:hAnsi="Calibri" w:cs="Calibri"/>
+          <w:sz w:val="22"/>
+          <w:szCs w:val="22"/>
+        </w:rPr>
+        <w:t xml:space="preserve"> </w:t>
+      </w:r>
+      <w:r>
+        <w:rPr>
+          <w:rFonts w:ascii="Calibri" w:hAnsi="Calibri" w:cs="Calibri"/>
+          <w:sz w:val="22"/>
+          <w:szCs w:val="22"/>
+        </w:rPr>
+        <w:t>to support the experimental results.</w:t>
       </w:r>
     </w:p>
     <w:p>
@@ -1429,24 +1454,18 @@
           <w:sz w:val="22"/>
           <w:szCs w:val="22"/>
         </w:rPr>
-        <w:t xml:space="preserve">Utilizing geochemical models to </w:t>
-      </w:r>
-      <w:r>
-        <w:rPr>
-          <w:rFonts w:ascii="Calibri" w:hAnsi="Calibri" w:cs="Calibri"/>
-          <w:sz w:val="22"/>
-          <w:szCs w:val="22"/>
-        </w:rPr>
-        <w:t>assess the reaction kinetics and pathways</w:t>
-      </w:r>
-      <w:r>
-        <w:rPr>
-          <w:rFonts w:ascii="Calibri" w:hAnsi="Calibri" w:cs="Calibri"/>
-          <w:sz w:val="22"/>
-          <w:szCs w:val="22"/>
-        </w:rPr>
-        <w:t>,</w:t>
-      </w:r>
+        <w:t xml:space="preserve">Investigating the </w:t>
+      </w:r>
+      <w:proofErr w:type="spellStart"/>
+      <w:r>
+        <w:rPr>
+          <w:rFonts w:ascii="Calibri" w:hAnsi="Calibri" w:cs="Calibri"/>
+          <w:sz w:val="22"/>
+          <w:szCs w:val="22"/>
+        </w:rPr>
+        <w:t>geomechanical</w:t>
+      </w:r>
+      <w:proofErr w:type="spellEnd"/>
       <w:r>
         <w:rPr>
           <w:rFonts w:ascii="Calibri" w:hAnsi="Calibri" w:cs="Calibri"/>
@@ -1461,17 +1480,37 @@
           <w:sz w:val="22"/>
           <w:szCs w:val="22"/>
         </w:rPr>
-        <w:t>to support the experimental results.</w:t>
-      </w:r>
-    </w:p>
-    <w:p>
-      <w:pPr>
-        <w:pStyle w:val="ListParagraph"/>
-        <w:numPr>
-          <w:ilvl w:val="0"/>
-          <w:numId w:val="7"/>
-        </w:numPr>
-        <w:spacing w:line="240" w:lineRule="auto"/>
+        <w:t xml:space="preserve">implications of </w:t>
+      </w:r>
+      <w:r>
+        <w:rPr>
+          <w:rFonts w:ascii="Calibri" w:hAnsi="Calibri" w:cs="Calibri"/>
+          <w:sz w:val="22"/>
+          <w:szCs w:val="22"/>
+        </w:rPr>
+        <w:t>large</w:t>
+      </w:r>
+      <w:r>
+        <w:rPr>
+          <w:rFonts w:ascii="Calibri" w:hAnsi="Calibri" w:cs="Calibri"/>
+          <w:sz w:val="22"/>
+          <w:szCs w:val="22"/>
+        </w:rPr>
+        <w:t>-scale geologic hydrogen production via serpentinization</w:t>
+      </w:r>
+      <w:r>
+        <w:rPr>
+          <w:rFonts w:ascii="Calibri" w:hAnsi="Calibri" w:cs="Calibri"/>
+          <w:sz w:val="22"/>
+          <w:szCs w:val="22"/>
+        </w:rPr>
+        <w:t>.</w:t>
+      </w:r>
+    </w:p>
+    <w:p>
+      <w:pPr>
+        <w:spacing w:line="240" w:lineRule="auto"/>
+        <w:ind w:left="7920" w:hanging="7920"/>
         <w:rPr>
           <w:rFonts w:ascii="Calibri" w:hAnsi="Calibri" w:cs="Calibri"/>
           <w:sz w:val="22"/>
@@ -1485,75 +1524,6 @@
           <w:szCs w:val="22"/>
         </w:rPr>
         <w:lastRenderedPageBreak/>
-        <w:t xml:space="preserve">Investigating the </w:t>
-      </w:r>
-      <w:proofErr w:type="spellStart"/>
-      <w:r>
-        <w:rPr>
-          <w:rFonts w:ascii="Calibri" w:hAnsi="Calibri" w:cs="Calibri"/>
-          <w:sz w:val="22"/>
-          <w:szCs w:val="22"/>
-        </w:rPr>
-        <w:t>geomechanical</w:t>
-      </w:r>
-      <w:proofErr w:type="spellEnd"/>
-      <w:r>
-        <w:rPr>
-          <w:rFonts w:ascii="Calibri" w:hAnsi="Calibri" w:cs="Calibri"/>
-          <w:sz w:val="22"/>
-          <w:szCs w:val="22"/>
-        </w:rPr>
-        <w:t xml:space="preserve"> </w:t>
-      </w:r>
-      <w:r>
-        <w:rPr>
-          <w:rFonts w:ascii="Calibri" w:hAnsi="Calibri" w:cs="Calibri"/>
-          <w:sz w:val="22"/>
-          <w:szCs w:val="22"/>
-        </w:rPr>
-        <w:t xml:space="preserve">implications of </w:t>
-      </w:r>
-      <w:r>
-        <w:rPr>
-          <w:rFonts w:ascii="Calibri" w:hAnsi="Calibri" w:cs="Calibri"/>
-          <w:sz w:val="22"/>
-          <w:szCs w:val="22"/>
-        </w:rPr>
-        <w:t>large</w:t>
-      </w:r>
-      <w:r>
-        <w:rPr>
-          <w:rFonts w:ascii="Calibri" w:hAnsi="Calibri" w:cs="Calibri"/>
-          <w:sz w:val="22"/>
-          <w:szCs w:val="22"/>
-        </w:rPr>
-        <w:t>-scale geologic hydrogen production via serpentinization</w:t>
-      </w:r>
-      <w:r>
-        <w:rPr>
-          <w:rFonts w:ascii="Calibri" w:hAnsi="Calibri" w:cs="Calibri"/>
-          <w:sz w:val="22"/>
-          <w:szCs w:val="22"/>
-        </w:rPr>
-        <w:t>.</w:t>
-      </w:r>
-    </w:p>
-    <w:p>
-      <w:pPr>
-        <w:spacing w:line="240" w:lineRule="auto"/>
-        <w:ind w:left="7920" w:hanging="7920"/>
-        <w:rPr>
-          <w:rFonts w:ascii="Calibri" w:hAnsi="Calibri" w:cs="Calibri"/>
-          <w:sz w:val="22"/>
-          <w:szCs w:val="22"/>
-        </w:rPr>
-      </w:pPr>
-      <w:r>
-        <w:rPr>
-          <w:rFonts w:ascii="Calibri" w:hAnsi="Calibri" w:cs="Calibri"/>
-          <w:sz w:val="22"/>
-          <w:szCs w:val="22"/>
-        </w:rPr>
         <w:t xml:space="preserve">Graduate Research Assistant, </w:t>
       </w:r>
       <w:r>
@@ -2743,7 +2713,6 @@
           <w:sz w:val="26"/>
           <w:szCs w:val="26"/>
         </w:rPr>
-        <w:lastRenderedPageBreak/>
         <w:t>Technical Skills</w:t>
       </w:r>
     </w:p>
@@ -2824,6 +2793,7 @@
           <w:sz w:val="22"/>
           <w:szCs w:val="22"/>
         </w:rPr>
+        <w:lastRenderedPageBreak/>
         <w:t>Python</w:t>
       </w:r>
       <w:r>
@@ -4320,7 +4290,6 @@
           <w:sz w:val="22"/>
           <w:szCs w:val="22"/>
         </w:rPr>
-        <w:lastRenderedPageBreak/>
         <w:t xml:space="preserve">Utilized Excel and Power BI for data </w:t>
       </w:r>
       <w:r>
@@ -4461,6 +4430,7 @@
           <w:sz w:val="26"/>
           <w:szCs w:val="26"/>
         </w:rPr>
+        <w:lastRenderedPageBreak/>
         <w:t>Awards &amp; Honors</w:t>
       </w:r>
     </w:p>

</xml_diff>

<commit_message>
Deploying to gh-pages from @ Neme0/Neme0.github.io@6907d5de832116d8795a18beb03acdddad933665 🚀
</commit_message>
<xml_diff>
--- a/assets/pdf/Chinemerem_Okezie_CV.docx
+++ b/assets/pdf/Chinemerem_Okezie_CV.docx
@@ -5,6 +5,7 @@
     <w:p>
       <w:pPr>
         <w:spacing w:line="240" w:lineRule="auto"/>
+        <w:jc w:val="center"/>
         <w:rPr>
           <w:rFonts w:ascii="Calibri" w:hAnsi="Calibri" w:cs="Calibri"/>
           <w:b/>
@@ -1223,15 +1224,159 @@
           <w:sz w:val="22"/>
           <w:szCs w:val="22"/>
         </w:rPr>
-        <w:t xml:space="preserve">Investigating the impact of rock/fluid composition and different </w:t>
-      </w:r>
-      <w:r>
-        <w:rPr>
-          <w:rFonts w:ascii="Calibri" w:hAnsi="Calibri" w:cs="Calibri"/>
-          <w:sz w:val="22"/>
-          <w:szCs w:val="22"/>
-        </w:rPr>
-        <w:t>hydrothermal conditions on geologic hydrogen production via serpentinization.</w:t>
+        <w:t>Utiliz</w:t>
+      </w:r>
+      <w:r>
+        <w:rPr>
+          <w:rFonts w:ascii="Calibri" w:hAnsi="Calibri" w:cs="Calibri"/>
+          <w:sz w:val="22"/>
+          <w:szCs w:val="22"/>
+        </w:rPr>
+        <w:t>ing</w:t>
+      </w:r>
+      <w:r>
+        <w:rPr>
+          <w:rFonts w:ascii="Calibri" w:hAnsi="Calibri" w:cs="Calibri"/>
+          <w:sz w:val="22"/>
+          <w:szCs w:val="22"/>
+        </w:rPr>
+        <w:t xml:space="preserve"> analytical techniques such as scanning electron microscopy </w:t>
+      </w:r>
+      <w:r>
+        <w:rPr>
+          <w:rFonts w:ascii="Calibri" w:hAnsi="Calibri" w:cs="Calibri"/>
+          <w:sz w:val="22"/>
+          <w:szCs w:val="22"/>
+        </w:rPr>
+        <w:t xml:space="preserve">coupled with energy dispersive </w:t>
+      </w:r>
+      <w:r>
+        <w:rPr>
+          <w:rFonts w:ascii="Calibri" w:hAnsi="Calibri" w:cs="Calibri"/>
+          <w:sz w:val="22"/>
+          <w:szCs w:val="22"/>
+        </w:rPr>
+        <w:t>X</w:t>
+      </w:r>
+      <w:r>
+        <w:rPr>
+          <w:rFonts w:ascii="Calibri" w:hAnsi="Calibri" w:cs="Calibri"/>
+          <w:sz w:val="22"/>
+          <w:szCs w:val="22"/>
+        </w:rPr>
+        <w:t xml:space="preserve">-ray </w:t>
+      </w:r>
+      <w:r>
+        <w:rPr>
+          <w:rFonts w:ascii="Calibri" w:hAnsi="Calibri" w:cs="Calibri"/>
+          <w:sz w:val="22"/>
+          <w:szCs w:val="22"/>
+        </w:rPr>
+        <w:t>spectroscopy (SEM-EDS)</w:t>
+      </w:r>
+      <w:r>
+        <w:rPr>
+          <w:rFonts w:ascii="Calibri" w:hAnsi="Calibri" w:cs="Calibri"/>
+          <w:sz w:val="22"/>
+          <w:szCs w:val="22"/>
+        </w:rPr>
+        <w:t>, X-ray D</w:t>
+      </w:r>
+      <w:r>
+        <w:rPr>
+          <w:rFonts w:ascii="Calibri" w:hAnsi="Calibri" w:cs="Calibri"/>
+          <w:sz w:val="22"/>
+          <w:szCs w:val="22"/>
+        </w:rPr>
+        <w:t>iffraction</w:t>
+      </w:r>
+      <w:r>
+        <w:rPr>
+          <w:rFonts w:ascii="Calibri" w:hAnsi="Calibri" w:cs="Calibri"/>
+          <w:sz w:val="22"/>
+          <w:szCs w:val="22"/>
+        </w:rPr>
+        <w:t xml:space="preserve"> (XRD)</w:t>
+      </w:r>
+      <w:r>
+        <w:rPr>
+          <w:rFonts w:ascii="Calibri" w:hAnsi="Calibri" w:cs="Calibri"/>
+          <w:sz w:val="22"/>
+          <w:szCs w:val="22"/>
+        </w:rPr>
+        <w:t>, Therm</w:t>
+      </w:r>
+      <w:r>
+        <w:rPr>
+          <w:rFonts w:ascii="Calibri" w:hAnsi="Calibri" w:cs="Calibri"/>
+          <w:sz w:val="22"/>
+          <w:szCs w:val="22"/>
+        </w:rPr>
+        <w:t>og</w:t>
+      </w:r>
+      <w:r>
+        <w:rPr>
+          <w:rFonts w:ascii="Calibri" w:hAnsi="Calibri" w:cs="Calibri"/>
+          <w:sz w:val="22"/>
+          <w:szCs w:val="22"/>
+        </w:rPr>
+        <w:t>ravimetric Analysis</w:t>
+      </w:r>
+      <w:r>
+        <w:rPr>
+          <w:rFonts w:ascii="Calibri" w:hAnsi="Calibri" w:cs="Calibri"/>
+          <w:sz w:val="22"/>
+          <w:szCs w:val="22"/>
+        </w:rPr>
+        <w:t xml:space="preserve"> (TGA)</w:t>
+      </w:r>
+      <w:r>
+        <w:rPr>
+          <w:rFonts w:ascii="Calibri" w:hAnsi="Calibri" w:cs="Calibri"/>
+          <w:sz w:val="22"/>
+          <w:szCs w:val="22"/>
+        </w:rPr>
+        <w:t xml:space="preserve">, </w:t>
+      </w:r>
+      <w:r>
+        <w:rPr>
+          <w:rFonts w:ascii="Calibri" w:hAnsi="Calibri" w:cs="Calibri"/>
+          <w:sz w:val="22"/>
+          <w:szCs w:val="22"/>
+        </w:rPr>
+        <w:t xml:space="preserve">and </w:t>
+      </w:r>
+      <w:r>
+        <w:rPr>
+          <w:rFonts w:ascii="Calibri" w:hAnsi="Calibri" w:cs="Calibri"/>
+          <w:sz w:val="22"/>
+          <w:szCs w:val="22"/>
+        </w:rPr>
+        <w:t>Raman Spectroscopy</w:t>
+      </w:r>
+      <w:r>
+        <w:rPr>
+          <w:rFonts w:ascii="Calibri" w:hAnsi="Calibri" w:cs="Calibri"/>
+          <w:sz w:val="22"/>
+          <w:szCs w:val="22"/>
+        </w:rPr>
+        <w:t>, to</w:t>
+      </w:r>
+      <w:r>
+        <w:rPr>
+          <w:rFonts w:ascii="Calibri" w:hAnsi="Calibri" w:cs="Calibri"/>
+          <w:sz w:val="22"/>
+          <w:szCs w:val="22"/>
+        </w:rPr>
+        <w:t xml:space="preserve"> assess the </w:t>
+      </w:r>
+      <w:r>
+        <w:rPr>
+          <w:rFonts w:ascii="Calibri" w:hAnsi="Calibri" w:cs="Calibri"/>
+          <w:sz w:val="22"/>
+          <w:szCs w:val="22"/>
+        </w:rPr>
+        <w:t>reaction progress and mineralogical evolution.</w:t>
       </w:r>
     </w:p>
     <w:p>
@@ -1254,159 +1399,39 @@
           <w:sz w:val="22"/>
           <w:szCs w:val="22"/>
         </w:rPr>
-        <w:t>Utiliz</w:t>
-      </w:r>
-      <w:r>
-        <w:rPr>
-          <w:rFonts w:ascii="Calibri" w:hAnsi="Calibri" w:cs="Calibri"/>
-          <w:sz w:val="22"/>
-          <w:szCs w:val="22"/>
-        </w:rPr>
-        <w:t>ing</w:t>
-      </w:r>
-      <w:r>
-        <w:rPr>
-          <w:rFonts w:ascii="Calibri" w:hAnsi="Calibri" w:cs="Calibri"/>
-          <w:sz w:val="22"/>
-          <w:szCs w:val="22"/>
-        </w:rPr>
-        <w:t xml:space="preserve"> analytical techniques such as scanning electron microscopy </w:t>
-      </w:r>
-      <w:r>
-        <w:rPr>
-          <w:rFonts w:ascii="Calibri" w:hAnsi="Calibri" w:cs="Calibri"/>
-          <w:sz w:val="22"/>
-          <w:szCs w:val="22"/>
-        </w:rPr>
-        <w:t xml:space="preserve">coupled with energy dispersive </w:t>
-      </w:r>
-      <w:r>
-        <w:rPr>
-          <w:rFonts w:ascii="Calibri" w:hAnsi="Calibri" w:cs="Calibri"/>
-          <w:sz w:val="22"/>
-          <w:szCs w:val="22"/>
-        </w:rPr>
-        <w:t>X</w:t>
-      </w:r>
-      <w:r>
-        <w:rPr>
-          <w:rFonts w:ascii="Calibri" w:hAnsi="Calibri" w:cs="Calibri"/>
-          <w:sz w:val="22"/>
-          <w:szCs w:val="22"/>
-        </w:rPr>
-        <w:t xml:space="preserve">-ray </w:t>
-      </w:r>
-      <w:r>
-        <w:rPr>
-          <w:rFonts w:ascii="Calibri" w:hAnsi="Calibri" w:cs="Calibri"/>
-          <w:sz w:val="22"/>
-          <w:szCs w:val="22"/>
-        </w:rPr>
-        <w:t>spectroscopy (SEM-EDS)</w:t>
-      </w:r>
-      <w:r>
-        <w:rPr>
-          <w:rFonts w:ascii="Calibri" w:hAnsi="Calibri" w:cs="Calibri"/>
-          <w:sz w:val="22"/>
-          <w:szCs w:val="22"/>
-        </w:rPr>
-        <w:t>, X-ray D</w:t>
-      </w:r>
-      <w:r>
-        <w:rPr>
-          <w:rFonts w:ascii="Calibri" w:hAnsi="Calibri" w:cs="Calibri"/>
-          <w:sz w:val="22"/>
-          <w:szCs w:val="22"/>
-        </w:rPr>
-        <w:t>iffraction</w:t>
-      </w:r>
-      <w:r>
-        <w:rPr>
-          <w:rFonts w:ascii="Calibri" w:hAnsi="Calibri" w:cs="Calibri"/>
-          <w:sz w:val="22"/>
-          <w:szCs w:val="22"/>
-        </w:rPr>
-        <w:t xml:space="preserve"> (XRD)</w:t>
-      </w:r>
-      <w:r>
-        <w:rPr>
-          <w:rFonts w:ascii="Calibri" w:hAnsi="Calibri" w:cs="Calibri"/>
-          <w:sz w:val="22"/>
-          <w:szCs w:val="22"/>
-        </w:rPr>
-        <w:t>, Therm</w:t>
-      </w:r>
-      <w:r>
-        <w:rPr>
-          <w:rFonts w:ascii="Calibri" w:hAnsi="Calibri" w:cs="Calibri"/>
-          <w:sz w:val="22"/>
-          <w:szCs w:val="22"/>
-        </w:rPr>
-        <w:t>og</w:t>
-      </w:r>
-      <w:r>
-        <w:rPr>
-          <w:rFonts w:ascii="Calibri" w:hAnsi="Calibri" w:cs="Calibri"/>
-          <w:sz w:val="22"/>
-          <w:szCs w:val="22"/>
-        </w:rPr>
-        <w:t>ravimetric Analysis</w:t>
-      </w:r>
-      <w:r>
-        <w:rPr>
-          <w:rFonts w:ascii="Calibri" w:hAnsi="Calibri" w:cs="Calibri"/>
-          <w:sz w:val="22"/>
-          <w:szCs w:val="22"/>
-        </w:rPr>
-        <w:t xml:space="preserve"> (TGA)</w:t>
-      </w:r>
-      <w:r>
-        <w:rPr>
-          <w:rFonts w:ascii="Calibri" w:hAnsi="Calibri" w:cs="Calibri"/>
-          <w:sz w:val="22"/>
-          <w:szCs w:val="22"/>
-        </w:rPr>
-        <w:t xml:space="preserve">, </w:t>
-      </w:r>
-      <w:r>
-        <w:rPr>
-          <w:rFonts w:ascii="Calibri" w:hAnsi="Calibri" w:cs="Calibri"/>
-          <w:sz w:val="22"/>
-          <w:szCs w:val="22"/>
-        </w:rPr>
-        <w:t xml:space="preserve">and </w:t>
-      </w:r>
-      <w:r>
-        <w:rPr>
-          <w:rFonts w:ascii="Calibri" w:hAnsi="Calibri" w:cs="Calibri"/>
-          <w:sz w:val="22"/>
-          <w:szCs w:val="22"/>
-        </w:rPr>
-        <w:t>Raman Spectroscopy</w:t>
-      </w:r>
-      <w:r>
-        <w:rPr>
-          <w:rFonts w:ascii="Calibri" w:hAnsi="Calibri" w:cs="Calibri"/>
-          <w:sz w:val="22"/>
-          <w:szCs w:val="22"/>
-        </w:rPr>
-        <w:t>, to</w:t>
-      </w:r>
-      <w:r>
-        <w:rPr>
-          <w:rFonts w:ascii="Calibri" w:hAnsi="Calibri" w:cs="Calibri"/>
-          <w:sz w:val="22"/>
-          <w:szCs w:val="22"/>
-        </w:rPr>
-        <w:t xml:space="preserve"> assess the </w:t>
-      </w:r>
-      <w:r>
-        <w:rPr>
-          <w:rFonts w:ascii="Calibri" w:hAnsi="Calibri" w:cs="Calibri"/>
-          <w:sz w:val="22"/>
-          <w:szCs w:val="22"/>
-        </w:rPr>
-        <w:t>reaction progress and mineralogical evolution.</w:t>
+        <w:t xml:space="preserve">Utilizing geochemical models to </w:t>
+      </w:r>
+      <w:r>
+        <w:rPr>
+          <w:rFonts w:ascii="Calibri" w:hAnsi="Calibri" w:cs="Calibri"/>
+          <w:sz w:val="22"/>
+          <w:szCs w:val="22"/>
+        </w:rPr>
+        <w:t>assess the reaction kinetics and pathways</w:t>
+      </w:r>
+      <w:r>
+        <w:rPr>
+          <w:rFonts w:ascii="Calibri" w:hAnsi="Calibri" w:cs="Calibri"/>
+          <w:sz w:val="22"/>
+          <w:szCs w:val="22"/>
+        </w:rPr>
+        <w:t>,</w:t>
+      </w:r>
+      <w:r>
+        <w:rPr>
+          <w:rFonts w:ascii="Calibri" w:hAnsi="Calibri" w:cs="Calibri"/>
+          <w:sz w:val="22"/>
+          <w:szCs w:val="22"/>
+        </w:rPr>
+        <w:t xml:space="preserve"> </w:t>
+      </w:r>
+      <w:r>
+        <w:rPr>
+          <w:rFonts w:ascii="Calibri" w:hAnsi="Calibri" w:cs="Calibri"/>
+          <w:sz w:val="22"/>
+          <w:szCs w:val="22"/>
+        </w:rPr>
+        <w:t>to support the experimental results.</w:t>
       </w:r>
     </w:p>
     <w:p>
@@ -1429,24 +1454,18 @@
           <w:sz w:val="22"/>
           <w:szCs w:val="22"/>
         </w:rPr>
-        <w:t xml:space="preserve">Utilizing geochemical models to </w:t>
-      </w:r>
-      <w:r>
-        <w:rPr>
-          <w:rFonts w:ascii="Calibri" w:hAnsi="Calibri" w:cs="Calibri"/>
-          <w:sz w:val="22"/>
-          <w:szCs w:val="22"/>
-        </w:rPr>
-        <w:t>assess the reaction kinetics and pathways</w:t>
-      </w:r>
-      <w:r>
-        <w:rPr>
-          <w:rFonts w:ascii="Calibri" w:hAnsi="Calibri" w:cs="Calibri"/>
-          <w:sz w:val="22"/>
-          <w:szCs w:val="22"/>
-        </w:rPr>
-        <w:t>,</w:t>
-      </w:r>
+        <w:t xml:space="preserve">Investigating the </w:t>
+      </w:r>
+      <w:proofErr w:type="spellStart"/>
+      <w:r>
+        <w:rPr>
+          <w:rFonts w:ascii="Calibri" w:hAnsi="Calibri" w:cs="Calibri"/>
+          <w:sz w:val="22"/>
+          <w:szCs w:val="22"/>
+        </w:rPr>
+        <w:t>geomechanical</w:t>
+      </w:r>
+      <w:proofErr w:type="spellEnd"/>
       <w:r>
         <w:rPr>
           <w:rFonts w:ascii="Calibri" w:hAnsi="Calibri" w:cs="Calibri"/>
@@ -1461,17 +1480,37 @@
           <w:sz w:val="22"/>
           <w:szCs w:val="22"/>
         </w:rPr>
-        <w:t>to support the experimental results.</w:t>
-      </w:r>
-    </w:p>
-    <w:p>
-      <w:pPr>
-        <w:pStyle w:val="ListParagraph"/>
-        <w:numPr>
-          <w:ilvl w:val="0"/>
-          <w:numId w:val="7"/>
-        </w:numPr>
-        <w:spacing w:line="240" w:lineRule="auto"/>
+        <w:t xml:space="preserve">implications of </w:t>
+      </w:r>
+      <w:r>
+        <w:rPr>
+          <w:rFonts w:ascii="Calibri" w:hAnsi="Calibri" w:cs="Calibri"/>
+          <w:sz w:val="22"/>
+          <w:szCs w:val="22"/>
+        </w:rPr>
+        <w:t>large</w:t>
+      </w:r>
+      <w:r>
+        <w:rPr>
+          <w:rFonts w:ascii="Calibri" w:hAnsi="Calibri" w:cs="Calibri"/>
+          <w:sz w:val="22"/>
+          <w:szCs w:val="22"/>
+        </w:rPr>
+        <w:t>-scale geologic hydrogen production via serpentinization</w:t>
+      </w:r>
+      <w:r>
+        <w:rPr>
+          <w:rFonts w:ascii="Calibri" w:hAnsi="Calibri" w:cs="Calibri"/>
+          <w:sz w:val="22"/>
+          <w:szCs w:val="22"/>
+        </w:rPr>
+        <w:t>.</w:t>
+      </w:r>
+    </w:p>
+    <w:p>
+      <w:pPr>
+        <w:spacing w:line="240" w:lineRule="auto"/>
+        <w:ind w:left="7920" w:hanging="7920"/>
         <w:rPr>
           <w:rFonts w:ascii="Calibri" w:hAnsi="Calibri" w:cs="Calibri"/>
           <w:sz w:val="22"/>
@@ -1485,75 +1524,6 @@
           <w:szCs w:val="22"/>
         </w:rPr>
         <w:lastRenderedPageBreak/>
-        <w:t xml:space="preserve">Investigating the </w:t>
-      </w:r>
-      <w:proofErr w:type="spellStart"/>
-      <w:r>
-        <w:rPr>
-          <w:rFonts w:ascii="Calibri" w:hAnsi="Calibri" w:cs="Calibri"/>
-          <w:sz w:val="22"/>
-          <w:szCs w:val="22"/>
-        </w:rPr>
-        <w:t>geomechanical</w:t>
-      </w:r>
-      <w:proofErr w:type="spellEnd"/>
-      <w:r>
-        <w:rPr>
-          <w:rFonts w:ascii="Calibri" w:hAnsi="Calibri" w:cs="Calibri"/>
-          <w:sz w:val="22"/>
-          <w:szCs w:val="22"/>
-        </w:rPr>
-        <w:t xml:space="preserve"> </w:t>
-      </w:r>
-      <w:r>
-        <w:rPr>
-          <w:rFonts w:ascii="Calibri" w:hAnsi="Calibri" w:cs="Calibri"/>
-          <w:sz w:val="22"/>
-          <w:szCs w:val="22"/>
-        </w:rPr>
-        <w:t xml:space="preserve">implications of </w:t>
-      </w:r>
-      <w:r>
-        <w:rPr>
-          <w:rFonts w:ascii="Calibri" w:hAnsi="Calibri" w:cs="Calibri"/>
-          <w:sz w:val="22"/>
-          <w:szCs w:val="22"/>
-        </w:rPr>
-        <w:t>large</w:t>
-      </w:r>
-      <w:r>
-        <w:rPr>
-          <w:rFonts w:ascii="Calibri" w:hAnsi="Calibri" w:cs="Calibri"/>
-          <w:sz w:val="22"/>
-          <w:szCs w:val="22"/>
-        </w:rPr>
-        <w:t>-scale geologic hydrogen production via serpentinization</w:t>
-      </w:r>
-      <w:r>
-        <w:rPr>
-          <w:rFonts w:ascii="Calibri" w:hAnsi="Calibri" w:cs="Calibri"/>
-          <w:sz w:val="22"/>
-          <w:szCs w:val="22"/>
-        </w:rPr>
-        <w:t>.</w:t>
-      </w:r>
-    </w:p>
-    <w:p>
-      <w:pPr>
-        <w:spacing w:line="240" w:lineRule="auto"/>
-        <w:ind w:left="7920" w:hanging="7920"/>
-        <w:rPr>
-          <w:rFonts w:ascii="Calibri" w:hAnsi="Calibri" w:cs="Calibri"/>
-          <w:sz w:val="22"/>
-          <w:szCs w:val="22"/>
-        </w:rPr>
-      </w:pPr>
-      <w:r>
-        <w:rPr>
-          <w:rFonts w:ascii="Calibri" w:hAnsi="Calibri" w:cs="Calibri"/>
-          <w:sz w:val="22"/>
-          <w:szCs w:val="22"/>
-        </w:rPr>
         <w:t xml:space="preserve">Graduate Research Assistant, </w:t>
       </w:r>
       <w:r>
@@ -2743,7 +2713,6 @@
           <w:sz w:val="26"/>
           <w:szCs w:val="26"/>
         </w:rPr>
-        <w:lastRenderedPageBreak/>
         <w:t>Technical Skills</w:t>
       </w:r>
     </w:p>
@@ -2824,6 +2793,7 @@
           <w:sz w:val="22"/>
           <w:szCs w:val="22"/>
         </w:rPr>
+        <w:lastRenderedPageBreak/>
         <w:t>Python</w:t>
       </w:r>
       <w:r>
@@ -4320,7 +4290,6 @@
           <w:sz w:val="22"/>
           <w:szCs w:val="22"/>
         </w:rPr>
-        <w:lastRenderedPageBreak/>
         <w:t xml:space="preserve">Utilized Excel and Power BI for data </w:t>
       </w:r>
       <w:r>
@@ -4461,6 +4430,7 @@
           <w:sz w:val="26"/>
           <w:szCs w:val="26"/>
         </w:rPr>
+        <w:lastRenderedPageBreak/>
         <w:t>Awards &amp; Honors</w:t>
       </w:r>
     </w:p>

</xml_diff>